<commit_message>
Finalize JBI package and repository metadata
</commit_message>
<xml_diff>
--- a/Submission package/manuscript.docx
+++ b/Submission package/manuscript.docx
@@ -320,7 +320,7 @@
         <w:pStyle w:val="FirstParagraph"/>
       </w:pPr>
       <w:r>
-        <w:t xml:space="preserve">In DepMap 24Q4, lines were classified by OncotreeCode into HCC (n=24), iCCA/IHCH (n=31), combined HCC and CC (KMCH1, n=1), and other (n=1,122); the later cell-line expression comparison (Figure 5B) used the 23 HCC and 30 iCCA lines that also have expression profiles. DepMap sample sizes therefore vary by data availability: the CRISPR dependency contrast uses 24 HCC and 31 iCCA lines, the line-expression comparisons use the 23 HCC and 30 iCCA lines with expression profiles, and program-level Chronos summaries use only lines with non-missing dependency values across the gene set. For each gene we computed selectivity versus all other lineages and the direct iCCA versus HCC contrast (Mann-Whitney with Benjamini-Hochberg FDR), and we annotated pan-lineage-essential genes (mean Chronos in other lineages below -0.5) and absolute essentiality (Chronos in iCCA lines below -0.5). TCGA differential expression used Mann-Whitney with BH-FDR. For the surviving signal we tested two gene programs, curated a priori from canonical pathway membership (iron handling; amino-acid transport) rather than derived from the contrast, at the program level by (i) a competitive permutation null (5,000 size-matched random gene sets) on the per-gene iCCA minus HCC dependency difference, (ii) a line-level Mann-Whitney of the per-line mean Chronos over the set (iCCA versus HCC lines), (iii) the same program’s coordinate expression in batch-free TCGA (CHOL versus LIHC), and (iv) the cross-line Spearman co-dependency structure. No multiplicity correction was applied across the small test family (two programs, four evidence legs each), so this analysis is exploratory. To quantify circularity, since two LAT1 genes are both in the program and among the selected genes, we repeated the dependency and expression tests after removing the discovery genes (SLC3A2, SLC7A5). Analyses used Python 3.13 (numpy, pandas, scipy, scikit-learn, statsmodels) and decoupleR with OmniPath [12]; no GPU was used. All scripts and intermediate tables are released.</w:t>
+        <w:t xml:space="preserve">In DepMap 24Q4, lines were classified by OncotreeCode into HCC (n=24), iCCA/IHCH (n=31), combined HCC and CC (KMCH1, n=1), and other (n=1,122); the later cell-line expression comparison (Figure 5B) used the 23 HCC and 30 iCCA lines that also have expression profiles. DepMap sample sizes therefore vary by data availability: the CRISPR dependency contrast uses 24 HCC and 31 iCCA lines, the line-expression comparisons use the 23 HCC and 30 iCCA lines with expression profiles, and program-level Chronos summaries use only lines with non-missing dependency values across the gene set. For each gene we computed selectivity versus all other lineages and the direct iCCA versus HCC contrast (Mann-Whitney with Benjamini-Hochberg FDR), and we annotated pan-lineage-essential genes (mean Chronos in other lineages below -0.5) and absolute essentiality (Chronos in iCCA lines below -0.5). TCGA differential expression used Mann-Whitney with BH-FDR. For the surviving signal we tested two gene programs, curated a priori from canonical pathway membership (iron handling; amino-acid transport) rather than derived from the contrast, at the program level by (i) a competitive permutation null (5,000 size-matched random gene sets) on the per-gene iCCA minus HCC dependency difference, (ii) a line-level Mann-Whitney of the per-line mean Chronos over the set (iCCA versus HCC lines), (iii) the same program’s coordinate expression in batch-free TCGA (CHOL versus LIHC), and (iv) the cross-line Spearman co-dependency structure. No multiplicity correction was applied across the small test family (two programs, four evidence legs each), so this analysis is exploratory. To quantify circularity, since two LAT1 genes are both in the program and among the selected genes, we repeated the dependency and expression tests after removing the discovery genes (SLC3A2, SLC7A5). Analyses used Python 3.13 (numpy, pandas, scipy, scikit-learn, statsmodels) and decoupleR with OmniPath [12]; no GPU was used. All scripts and intermediate tables are released at GitHub and Zenodo (DOI: 10.5281/zenodo.20888892).</w:t>
       </w:r>
     </w:p>
     <w:bookmarkEnd w:id="15"/>
@@ -629,7 +629,22 @@
         <w:pStyle w:val="FirstParagraph"/>
       </w:pPr>
       <w:r>
-        <w:t xml:space="preserve">All data are public (NODE OEP000321; NODE OEP001105; UCSC Xena GDC hub for TCGA-LIHC and TCGA-CHOL; GEO GSE241466; GEO GSE231854; iProX IPX0001962000; PRIDE PXD013523; TCGA-KIRC and TCGA-KIRP; DepMap 24Q4; OmniPath). The complete pipeline, intermediate matrices, per-gene tables, and figure scripts will be deposited in a public repository (Zenodo, with a DOI, and GitHub) at acceptance, and are available from the corresponding author meanwhile. The environment is Python 3.13 with numpy 2.4, pandas 2.3, scipy 1.18, scikit-learn 1.9, statsmodels 0.14, decoupleR 2.1.6, and omnipath 1.0.12; the OmniPath kinase-substrate snapshot used here returned 40,109 phosphorylation relations and 1,657 enzymes (retrieved 2026-06). A top-level script regenerates the stat files and Table 2.</w:t>
+        <w:t xml:space="preserve">All data are public (NODE OEP000321; NODE OEP001105; UCSC Xena GDC hub for TCGA-LIHC and TCGA-CHOL; GEO GSE241466; GEO GSE231854; iProX IPX0001962000; PRIDE PXD013523; TCGA-KIRC and TCGA-KIRP; DepMap 24Q4; OmniPath). The complete pipeline, result tables, figures, manuscript build scripts, and parsed intermediate matrices are released at GitHub (https://github.com/Goden26/single-cohort-proteogenomic-nonidentifiability) and archived at Zenodo (DOI: 10.5281/zenodo.20888892). Raw public input files are not redistributed in the code repository;</w:t>
+      </w:r>
+      <w:r>
+        <w:t xml:space="preserve"> </w:t>
+      </w:r>
+      <w:r>
+        <w:rPr>
+          <w:rStyle w:val="VerbatimChar"/>
+        </w:rPr>
+        <w:t xml:space="preserve">data_manifest.md</w:t>
+      </w:r>
+      <w:r>
+        <w:t xml:space="preserve"> </w:t>
+      </w:r>
+      <w:r>
+        <w:t xml:space="preserve">and the download scripts list the public sources and expected filenames. The environment is Python 3.13 with numpy 2.4, pandas 2.3, scipy 1.18, scikit-learn 1.9, statsmodels 0.14, decoupleR 2.1.6, and omnipath 1.0.12; the OmniPath kinase-substrate snapshot used here returned 40,109 phosphorylation relations and 1,657 enzymes (retrieved 2026-06). A top-level script regenerates the stat files and Table 2.</w:t>
       </w:r>
     </w:p>
     <w:bookmarkEnd w:id="26"/>

</xml_diff>